<commit_message>
Add brief step-by-step explanations to the English workshops
For the two English documents (Kinematics 2D and Newton's Laws), each solution
step now carries a short, precise explanation of what is being done, via a new
'step' helper in docbuild.py.

Co-Authored-By: Claude Opus 4.8 <noreply@anthropic.com>
Claude-Session: https://claude.ai/code/session_01Me2Hd5TQeG4ycB8wy6Rpa6
</commit_message>
<xml_diff>
--- a/talleres/Taller_Kinematics_2D_English.docx
+++ b/talleres/Taller_Kinematics_2D_English.docx
@@ -185,7 +185,7 @@
           <w:i/>
           <w:sz w:val="20"/>
         </w:rPr>
-        <w:t>General problem-solving strategy: (1) think, (2) sketch, (3) research, (4) simplify, (5) calculate, (6) round, (7) analyse. Unless stated otherwise, g = 9.8 m/s² and air resistance is neglected.</w:t>
+        <w:t>General problem-solving strategy: (1) think, (2) sketch, (3) research, (4) simplify, (5) calculate, (6) round, (7) analyse. Each step below is briefly explained. Unless stated otherwise, g = 9.8 m/s² and air resistance is neglected.</w:t>
       </w:r>
     </w:p>
     <w:p>
@@ -271,19 +271,28 @@
           <w:color w:val="2E5C8A"/>
           <w:sz w:val="23"/>
         </w:rPr>
-        <w:t>Governing relations</w:t>
+        <w:t>Solution</w:t>
       </w:r>
     </w:p>
     <w:p>
       <w:pPr>
-        <w:spacing w:after="80"/>
+        <w:spacing w:before="60" w:after="20"/>
+        <w:ind w:left="170"/>
       </w:pPr>
       <w:r>
         <w:rPr>
-          <w:i w:val="0"/>
-          <w:sz w:val="22"/>
+          <w:b/>
+          <w:color w:val="C0392B"/>
+          <w:sz w:val="21"/>
         </w:rPr>
-        <w:t>The horizontal range and the maximum height of a projectile launched from ground level are:</w:t>
+        <w:t xml:space="preserve">Step 1.  </w:t>
+      </w:r>
+      <w:r>
+        <w:rPr>
+          <w:color w:val="333333"/>
+          <w:sz w:val="21"/>
+        </w:rPr>
+        <w:t>Write the standard range and maximum-height formulas for a ground-level launch.</w:t>
       </w:r>
     </w:p>
     <w:p>
@@ -406,27 +415,23 @@
     </w:p>
     <w:p>
       <w:pPr>
-        <w:spacing w:before="120" w:after="40"/>
+        <w:spacing w:before="60" w:after="20"/>
+        <w:ind w:left="170"/>
       </w:pPr>
       <w:r>
         <w:rPr>
           <w:b/>
-          <w:color w:val="2E5C8A"/>
-          <w:sz w:val="23"/>
+          <w:color w:val="C0392B"/>
+          <w:sz w:val="21"/>
         </w:rPr>
-        <w:t>Solution</w:t>
+        <w:t xml:space="preserve">Step 2.  </w:t>
       </w:r>
-    </w:p>
-    <w:p>
-      <w:pPr>
-        <w:spacing w:after="80"/>
-      </w:pPr>
       <w:r>
         <w:rPr>
-          <w:i w:val="0"/>
-          <w:sz w:val="22"/>
+          <w:color w:val="333333"/>
+          <w:sz w:val="21"/>
         </w:rPr>
-        <w:t>Imposing R = 2h:</w:t>
+        <w:t>Impose the condition R = 2h; v₀² and g cancel.</w:t>
       </w:r>
     </w:p>
     <w:p>
@@ -584,14 +589,23 @@
     </w:p>
     <w:p>
       <w:pPr>
-        <w:spacing w:after="80"/>
+        <w:spacing w:before="60" w:after="20"/>
+        <w:ind w:left="170"/>
       </w:pPr>
       <w:r>
         <w:rPr>
-          <w:i w:val="0"/>
-          <w:sz w:val="22"/>
+          <w:b/>
+          <w:color w:val="C0392B"/>
+          <w:sz w:val="21"/>
         </w:rPr>
-        <w:t>Using the identity sin(2θ) = 2 sin θ cos θ:</w:t>
+        <w:t xml:space="preserve">Step 3.  </w:t>
+      </w:r>
+      <w:r>
+        <w:rPr>
+          <w:color w:val="333333"/>
+          <w:sz w:val="21"/>
+        </w:rPr>
+        <w:t>Expand sin(2θ) = 2 sinθ cosθ and cancel one sinθ to get tanθ.</w:t>
       </w:r>
     </w:p>
     <w:p>
@@ -690,6 +704,27 @@
           </m:r>
         </m:oMath>
       </m:oMathPara>
+    </w:p>
+    <w:p>
+      <w:pPr>
+        <w:spacing w:before="60" w:after="20"/>
+        <w:ind w:left="170"/>
+      </w:pPr>
+      <w:r>
+        <w:rPr>
+          <w:b/>
+          <w:color w:val="C0392B"/>
+          <w:sz w:val="21"/>
+        </w:rPr>
+        <w:t xml:space="preserve">Step 4.  </w:t>
+      </w:r>
+      <w:r>
+        <w:rPr>
+          <w:color w:val="333333"/>
+          <w:sz w:val="21"/>
+        </w:rPr>
+        <w:t>Take the inverse tangent to obtain the launch angle.</w:t>
+      </w:r>
     </w:p>
     <w:tbl>
       <w:tblPr>
@@ -853,14 +888,23 @@
     </w:p>
     <w:p>
       <w:pPr>
-        <w:spacing w:after="80"/>
+        <w:spacing w:before="60" w:after="20"/>
+        <w:ind w:left="170"/>
       </w:pPr>
       <w:r>
         <w:rPr>
-          <w:i w:val="0"/>
-          <w:sz w:val="22"/>
+          <w:b/>
+          <w:color w:val="C0392B"/>
+          <w:sz w:val="21"/>
         </w:rPr>
-        <w:t>(a)  Vertical motion is a free fall from rest (v₀ᵧ = 0). Setting y = 0 at impact:</w:t>
+        <w:t xml:space="preserve">Step 1.  </w:t>
+      </w:r>
+      <w:r>
+        <w:rPr>
+          <w:color w:val="333333"/>
+          <w:sz w:val="21"/>
+        </w:rPr>
+        <w:t>(a) The vertical motion is free fall from rest; set y = 0 at impact and solve for the fall time.</w:t>
       </w:r>
     </w:p>
     <w:p>
@@ -1009,14 +1053,23 @@
     </w:p>
     <w:p>
       <w:pPr>
-        <w:spacing w:after="80"/>
+        <w:spacing w:before="60" w:after="20"/>
+        <w:ind w:left="170"/>
       </w:pPr>
       <w:r>
         <w:rPr>
-          <w:i w:val="0"/>
-          <w:sz w:val="22"/>
+          <w:b/>
+          <w:color w:val="C0392B"/>
+          <w:sz w:val="21"/>
         </w:rPr>
-        <w:t>The horizontal distance travelled by the bomb is then:</w:t>
+        <w:t xml:space="preserve">Step 2.  </w:t>
+      </w:r>
+      <w:r>
+        <w:rPr>
+          <w:color w:val="333333"/>
+          <w:sz w:val="21"/>
+        </w:rPr>
+        <w:t>Multiply the constant horizontal speed by the fall time to get the horizontal range.</w:t>
       </w:r>
     </w:p>
     <w:p>
@@ -1119,14 +1172,23 @@
     </w:p>
     <w:p>
       <w:pPr>
-        <w:spacing w:after="80"/>
+        <w:spacing w:before="60" w:after="20"/>
+        <w:ind w:left="170"/>
       </w:pPr>
       <w:r>
         <w:rPr>
-          <w:i w:val="0"/>
-          <w:sz w:val="22"/>
+          <w:b/>
+          <w:color w:val="C0392B"/>
+          <w:sz w:val="21"/>
         </w:rPr>
-        <w:t>(b)  The bomb keeps the plane's horizontal velocity, so it stays directly below the plane throughout the fall. When the bomb hits the ground the plane is directly above the impact point — i.e. 6 805 m past the release point (3 000 m above the bomb).</w:t>
+        <w:t xml:space="preserve">Step 3.  </w:t>
+      </w:r>
+      <w:r>
+        <w:rPr>
+          <w:color w:val="333333"/>
+          <w:sz w:val="21"/>
+        </w:rPr>
+        <w:t>(b) Bomb and plane share the same horizontal velocity, so the plane stays directly above the bomb.</w:t>
       </w:r>
     </w:p>
     <w:tbl>
@@ -1171,14 +1233,23 @@
     </w:p>
     <w:p>
       <w:pPr>
-        <w:spacing w:after="80"/>
+        <w:spacing w:before="60" w:after="20"/>
+        <w:ind w:left="170"/>
       </w:pPr>
       <w:r>
         <w:rPr>
-          <w:i w:val="0"/>
-          <w:sz w:val="22"/>
+          <w:b/>
+          <w:color w:val="C0392B"/>
+          <w:sz w:val="21"/>
         </w:rPr>
-        <w:t>(c)  The line of sight to the target makes an angle φ with the vertical, where:</w:t>
+        <w:t xml:space="preserve">Step 4.  </w:t>
+      </w:r>
+      <w:r>
+        <w:rPr>
+          <w:color w:val="333333"/>
+          <w:sz w:val="21"/>
+        </w:rPr>
+        <w:t>(c) The sight line to the target makes angle φ with the vertical; take the arctangent of x/y₀.</w:t>
       </w:r>
     </w:p>
     <w:p>
@@ -1382,19 +1453,28 @@
           <w:color w:val="2E5C8A"/>
           <w:sz w:val="23"/>
         </w:rPr>
-        <w:t>Approach</w:t>
+        <w:t>Solution</w:t>
       </w:r>
     </w:p>
     <w:p>
       <w:pPr>
-        <w:spacing w:after="80"/>
+        <w:spacing w:before="60" w:after="20"/>
+        <w:ind w:left="170"/>
       </w:pPr>
       <w:r>
         <w:rPr>
-          <w:i w:val="0"/>
-          <w:sz w:val="22"/>
+          <w:b/>
+          <w:color w:val="C0392B"/>
+          <w:sz w:val="21"/>
         </w:rPr>
-        <w:t>The trajectory of the apple is the parabola</w:t>
+        <w:t xml:space="preserve">Step 1.  </w:t>
+      </w:r>
+      <w:r>
+        <w:rPr>
+          <w:color w:val="333333"/>
+          <w:sz w:val="21"/>
+        </w:rPr>
+        <w:t>Write the trajectory equation y(x) of the projectile.</w:t>
       </w:r>
     </w:p>
     <w:p>
@@ -1489,14 +1569,23 @@
     </w:p>
     <w:p>
       <w:pPr>
-        <w:spacing w:after="80"/>
+        <w:spacing w:before="60" w:after="20"/>
+        <w:ind w:left="170"/>
       </w:pPr>
       <w:r>
         <w:rPr>
-          <w:i w:val="0"/>
-          <w:sz w:val="22"/>
+          <w:b/>
+          <w:color w:val="C0392B"/>
+          <w:sz w:val="21"/>
         </w:rPr>
-        <w:t>Since Billy lies on the line y = 0.4x, at every point of that line y/x = 0.4. Substituting and using x = d·cos(tan⁻¹0.4) for Billy's horizontal coordinate:</w:t>
+        <w:t xml:space="preserve">Step 2.  </w:t>
+      </w:r>
+      <w:r>
+        <w:rPr>
+          <w:color w:val="333333"/>
+          <w:sz w:val="21"/>
+        </w:rPr>
+        <w:t>Billy lies on y = 0.4x, so replace y/x by 0.4; his horizontal coordinate is x = d·cos(tan⁻¹0.4).</w:t>
       </w:r>
     </w:p>
     <w:p>
@@ -1579,14 +1668,23 @@
     </w:p>
     <w:p>
       <w:pPr>
-        <w:spacing w:after="80"/>
+        <w:spacing w:before="60" w:after="20"/>
+        <w:ind w:left="170"/>
       </w:pPr>
       <w:r>
         <w:rPr>
-          <w:i w:val="0"/>
-          <w:sz w:val="22"/>
+          <w:b/>
+          <w:color w:val="C0392B"/>
+          <w:sz w:val="21"/>
         </w:rPr>
-        <w:t>Solving for v₀:</w:t>
+        <w:t xml:space="preserve">Step 3.  </w:t>
+      </w:r>
+      <w:r>
+        <w:rPr>
+          <w:color w:val="333333"/>
+          <w:sz w:val="21"/>
+        </w:rPr>
+        <w:t>Solve the equation algebraically for the launch speed v₀.</w:t>
       </w:r>
     </w:p>
     <w:p>
@@ -1717,14 +1815,23 @@
     </w:p>
     <w:p>
       <w:pPr>
-        <w:spacing w:after="80"/>
+        <w:spacing w:before="60" w:after="20"/>
+        <w:ind w:left="170"/>
       </w:pPr>
       <w:r>
         <w:rPr>
-          <w:i w:val="0"/>
-          <w:sz w:val="22"/>
+          <w:b/>
+          <w:color w:val="C0392B"/>
+          <w:sz w:val="21"/>
         </w:rPr>
-        <w:t>With x = 30·cos(21.8°) = 27.85 m, tan 50° = 1.1918 and cos²50° = 0.4132:</w:t>
+        <w:t xml:space="preserve">Step 4.  </w:t>
+      </w:r>
+      <w:r>
+        <w:rPr>
+          <w:color w:val="333333"/>
+          <w:sz w:val="21"/>
+        </w:rPr>
+        <w:t>Substitute x = 27.85 m, tan50° = 1.1918, cos²50° = 0.4132 and evaluate.</w:t>
       </w:r>
     </w:p>
     <w:p>
@@ -1915,31 +2022,28 @@
           <w:color w:val="2E5C8A"/>
           <w:sz w:val="23"/>
         </w:rPr>
-        <w:t>Approach</w:t>
+        <w:t>Solution</w:t>
       </w:r>
     </w:p>
     <w:p>
       <w:pPr>
-        <w:spacing w:after="80"/>
+        <w:spacing w:before="60" w:after="20"/>
+        <w:ind w:left="170"/>
       </w:pPr>
       <w:r>
         <w:rPr>
-          <w:i w:val="0"/>
-          <w:sz w:val="22"/>
+          <w:b/>
+          <w:color w:val="C0392B"/>
+          <w:sz w:val="21"/>
         </w:rPr>
-        <w:t>There are two motions: uniformly accelerated straight-line motion on the roof, then projectile motion after the edge.</w:t>
+        <w:t xml:space="preserve">Step 1.  </w:t>
       </w:r>
-    </w:p>
-    <w:p>
-      <w:pPr>
-        <w:spacing w:after="80"/>
-      </w:pPr>
       <w:r>
         <w:rPr>
-          <w:i w:val="0"/>
-          <w:sz w:val="22"/>
+          <w:color w:val="333333"/>
+          <w:sz w:val="21"/>
         </w:rPr>
-        <w:t>Motion 1 (on the roof) — from v² = v₀² + 2aL the speed at the edge is:</w:t>
+        <w:t>Stage 1 (on the roof): use v² = v₀² + 2aL to find the speed at the edge.</w:t>
       </w:r>
     </w:p>
     <w:p>
@@ -2010,26 +2114,44 @@
     </w:p>
     <w:p>
       <w:pPr>
-        <w:spacing w:after="80"/>
+        <w:spacing w:before="60" w:after="20"/>
+        <w:ind w:left="170"/>
       </w:pPr>
       <w:r>
         <w:rPr>
-          <w:i w:val="0"/>
-          <w:sz w:val="22"/>
+          <w:b/>
+          <w:color w:val="C0392B"/>
+          <w:sz w:val="21"/>
         </w:rPr>
-        <w:t>This is the launch speed for the second stage, directed 40° below the horizontal.</w:t>
+        <w:t xml:space="preserve">Step 2.  </w:t>
+      </w:r>
+      <w:r>
+        <w:rPr>
+          <w:color w:val="333333"/>
+          <w:sz w:val="21"/>
+        </w:rPr>
+        <w:t>This speed becomes the launch speed for stage 2, directed 40° below the horizontal.</w:t>
       </w:r>
     </w:p>
     <w:p>
       <w:pPr>
-        <w:spacing w:after="80"/>
+        <w:spacing w:before="60" w:after="20"/>
+        <w:ind w:left="170"/>
       </w:pPr>
       <w:r>
         <w:rPr>
-          <w:i w:val="0"/>
-          <w:sz w:val="22"/>
+          <w:b/>
+          <w:color w:val="C0392B"/>
+          <w:sz w:val="21"/>
         </w:rPr>
-        <w:t>Motion 2 (projectile) — taking the edge as origin and downward launch:</w:t>
+        <w:t xml:space="preserve">Step 3.  </w:t>
+      </w:r>
+      <w:r>
+        <w:rPr>
+          <w:color w:val="333333"/>
+          <w:sz w:val="21"/>
+        </w:rPr>
+        <w:t>Stage 2 (projectile): place the origin at the edge and set y = 0 at the snowbank.</w:t>
       </w:r>
     </w:p>
     <w:p>
@@ -2131,6 +2253,27 @@
           </m:sSup>
         </m:oMath>
       </m:oMathPara>
+    </w:p>
+    <w:p>
+      <w:pPr>
+        <w:spacing w:before="60" w:after="20"/>
+        <w:ind w:left="170"/>
+      </w:pPr>
+      <w:r>
+        <w:rPr>
+          <w:b/>
+          <w:color w:val="C0392B"/>
+          <w:sz w:val="21"/>
+        </w:rPr>
+        <w:t xml:space="preserve">Step 4.  </w:t>
+      </w:r>
+      <w:r>
+        <w:rPr>
+          <w:color w:val="333333"/>
+          <w:sz w:val="21"/>
+        </w:rPr>
+        <w:t>Solve the resulting quadratic in x and keep the positive root.</w:t>
+      </w:r>
     </w:p>
     <w:p>
       <w:pPr>
@@ -2376,14 +2519,23 @@
     </w:p>
     <w:p>
       <w:pPr>
-        <w:spacing w:after="80"/>
+        <w:spacing w:before="60" w:after="20"/>
+        <w:ind w:left="170"/>
       </w:pPr>
       <w:r>
         <w:rPr>
-          <w:i w:val="0"/>
-          <w:sz w:val="22"/>
+          <w:b/>
+          <w:color w:val="C0392B"/>
+          <w:sz w:val="21"/>
         </w:rPr>
-        <w:t>Take the ramp as origin, x horizontal, y upward. The landing point on the slope satisfies y = −x·tan 50°. With x = v₀cosθ·t and y = v₀sinθ·t − ½gt²:</w:t>
+        <w:t xml:space="preserve">Step 1.  </w:t>
+      </w:r>
+      <w:r>
+        <w:rPr>
+          <w:color w:val="333333"/>
+          <w:sz w:val="21"/>
+        </w:rPr>
+        <w:t>Landing point lies on the slope, so impose y = −x·tan50° with x = v₀cosθ·t and y = v₀sinθ·t − ½gt².</w:t>
       </w:r>
     </w:p>
     <w:p>
@@ -2395,10 +2547,13 @@
         <m:oMath>
           <m:f>
             <m:num>
+              <m:r>
+                <m:t xml:space="preserve">v</m:t>
+              </m:r>
               <m:sSub>
                 <m:e>
                   <m:r>
-                    <m:t xml:space="preserve">v</m:t>
+                    <m:t xml:space="preserve"/>
                   </m:r>
                 </m:e>
                 <m:sub>
@@ -2451,10 +2606,13 @@
               </m:sSup>
             </m:num>
             <m:den>
+              <m:r>
+                <m:t xml:space="preserve">v</m:t>
+              </m:r>
               <m:sSub>
                 <m:e>
                   <m:r>
-                    <m:t xml:space="preserve">v</m:t>
+                    <m:t xml:space="preserve"/>
                   </m:r>
                 </m:e>
                 <m:sub>
@@ -2497,6 +2655,27 @@
     </w:p>
     <w:p>
       <w:pPr>
+        <w:spacing w:before="60" w:after="20"/>
+        <w:ind w:left="170"/>
+      </w:pPr>
+      <w:r>
+        <w:rPr>
+          <w:b/>
+          <w:color w:val="C0392B"/>
+          <w:sz w:val="21"/>
+        </w:rPr>
+        <w:t xml:space="preserve">Step 2.  </w:t>
+      </w:r>
+      <w:r>
+        <w:rPr>
+          <w:color w:val="333333"/>
+          <w:sz w:val="21"/>
+        </w:rPr>
+        <w:t>Solve for the flight time t.</w:t>
+      </w:r>
+    </w:p>
+    <w:p>
+      <w:pPr>
         <w:spacing w:before="80" w:after="120"/>
         <w:jc w:val="center"/>
       </w:pPr>
@@ -2510,10 +2689,13 @@
           </m:r>
           <m:f>
             <m:num>
+              <m:r>
+                <m:t xml:space="preserve">v</m:t>
+              </m:r>
               <m:sSub>
                 <m:e>
                   <m:r>
-                    <m:t xml:space="preserve">v</m:t>
+                    <m:t xml:space="preserve"/>
                   </m:r>
                 </m:e>
                 <m:sub>
@@ -2590,14 +2772,23 @@
     </w:p>
     <w:p>
       <w:pPr>
-        <w:spacing w:after="80"/>
+        <w:spacing w:before="60" w:after="20"/>
+        <w:ind w:left="170"/>
       </w:pPr>
       <w:r>
         <w:rPr>
-          <w:i w:val="0"/>
-          <w:sz w:val="22"/>
+          <w:b/>
+          <w:color w:val="C0392B"/>
+          <w:sz w:val="21"/>
         </w:rPr>
-        <w:t>(a)  Horizontal reach x = (10.0 cos15°)(2.88) = 27.8 m, so the distance along the slope is:</w:t>
+        <w:t xml:space="preserve">Step 3.  </w:t>
+      </w:r>
+      <w:r>
+        <w:rPr>
+          <w:color w:val="333333"/>
+          <w:sz w:val="21"/>
+        </w:rPr>
+        <w:t>(a) Find the horizontal reach x, then divide by cos50° to get the distance d along the slope.</w:t>
       </w:r>
     </w:p>
     <w:p>
@@ -2702,14 +2893,23 @@
     </w:p>
     <w:p>
       <w:pPr>
-        <w:spacing w:after="80"/>
+        <w:spacing w:before="60" w:after="20"/>
+        <w:ind w:left="170"/>
       </w:pPr>
       <w:r>
         <w:rPr>
-          <w:i w:val="0"/>
-          <w:sz w:val="22"/>
+          <w:b/>
+          <w:color w:val="C0392B"/>
+          <w:sz w:val="21"/>
         </w:rPr>
-        <w:t>(b)  Velocity components just before landing:</w:t>
+        <w:t xml:space="preserve">Step 4.  </w:t>
+      </w:r>
+      <w:r>
+        <w:rPr>
+          <w:color w:val="333333"/>
+          <w:sz w:val="21"/>
+        </w:rPr>
+        <w:t>(b) Evaluate the velocity components at t = 2.88 s (vₓ is constant; v_y = v₀sinθ − gt).</w:t>
       </w:r>
     </w:p>
     <w:p>
@@ -2734,43 +2934,12 @@
           <m:r>
             <m:t xml:space="preserve">=</m:t>
           </m:r>
-          <m:sSub>
-            <m:e>
-              <m:r>
-                <m:t xml:space="preserve">v</m:t>
-              </m:r>
-            </m:e>
-            <m:sub>
-              <m:r>
-                <m:t xml:space="preserve">0</m:t>
-              </m:r>
-            </m:sub>
-          </m:sSub>
-          <m:r>
-            <m:rPr>
-              <m:sty m:val="p"/>
-            </m:rPr>
-            <m:t xml:space="preserve">cos</m:t>
-          </m:r>
-          <m:r>
-            <m:t xml:space="preserve">θ</m:t>
-          </m:r>
-          <m:r>
-            <m:t xml:space="preserve">=</m:t>
-          </m:r>
           <m:r>
             <m:t xml:space="preserve">9.7 m/s</m:t>
           </m:r>
-        </m:oMath>
-      </m:oMathPara>
-    </w:p>
-    <w:p>
-      <w:pPr>
-        <w:spacing w:before="80" w:after="120"/>
-        <w:jc w:val="center"/>
-      </w:pPr>
-      <m:oMathPara>
-        <m:oMath>
+          <m:r>
+            <m:t xml:space="preserve">   ,   </m:t>
+          </m:r>
           <m:sSub>
             <m:e>
               <m:r>
@@ -2783,39 +2952,6 @@
               </m:r>
             </m:sub>
           </m:sSub>
-          <m:r>
-            <m:t xml:space="preserve">=</m:t>
-          </m:r>
-          <m:sSub>
-            <m:e>
-              <m:r>
-                <m:t xml:space="preserve">v</m:t>
-              </m:r>
-            </m:e>
-            <m:sub>
-              <m:r>
-                <m:t xml:space="preserve">0</m:t>
-              </m:r>
-            </m:sub>
-          </m:sSub>
-          <m:r>
-            <m:rPr>
-              <m:sty m:val="p"/>
-            </m:rPr>
-            <m:t xml:space="preserve">sin</m:t>
-          </m:r>
-          <m:r>
-            <m:t xml:space="preserve">θ</m:t>
-          </m:r>
-          <m:r>
-            <m:t xml:space="preserve">−</m:t>
-          </m:r>
-          <m:r>
-            <m:t xml:space="preserve">g</m:t>
-          </m:r>
-          <m:r>
-            <m:t xml:space="preserve">t</m:t>
-          </m:r>
           <m:r>
             <m:t xml:space="preserve">=</m:t>
           </m:r>
@@ -2878,9 +3014,9 @@
       <w:r>
         <w:rPr>
           <w:i/>
-          <w:sz w:val="20"/>
+          <w:sz w:val="19"/>
         </w:rPr>
-        <w:t>Discussion: with air resistance the horizontal component would decay, shortening the range. By leaning into an airfoil shape the jumper generates lift and reduces drag, extending the flight time and therefore the distance.</w:t>
+        <w:t>Discussion: with air resistance the range would shorten; leaning into an airfoil shape adds lift and cuts drag, lengthening the flight and the distance.</w:t>
       </w:r>
     </w:p>
     <w:p>
@@ -2958,18 +3094,6 @@
     </w:p>
     <w:p>
       <w:pPr>
-        <w:spacing w:after="80"/>
-      </w:pPr>
-      <w:r>
-        <w:rPr>
-          <w:i w:val="0"/>
-          <w:sz w:val="22"/>
-        </w:rPr>
-        <w:t>Note: the 510 N weight is extra information; the motion does not depend on mass.</w:t>
-      </w:r>
-    </w:p>
-    <w:p>
-      <w:pPr>
         <w:spacing w:before="120" w:after="40"/>
       </w:pPr>
       <w:r>
@@ -2983,14 +3107,23 @@
     </w:p>
     <w:p>
       <w:pPr>
-        <w:spacing w:after="80"/>
+        <w:spacing w:before="60" w:after="20"/>
+        <w:ind w:left="170"/>
       </w:pPr>
       <w:r>
         <w:rPr>
-          <w:i w:val="0"/>
-          <w:sz w:val="22"/>
+          <w:b/>
+          <w:color w:val="C0392B"/>
+          <w:sz w:val="21"/>
         </w:rPr>
-        <w:t>Time to fall 9.00 m from rest in the vertical direction:</w:t>
+        <w:t xml:space="preserve">Step 1.  </w:t>
+      </w:r>
+      <w:r>
+        <w:rPr>
+          <w:color w:val="333333"/>
+          <w:sz w:val="21"/>
+        </w:rPr>
+        <w:t>The 510 N weight is irrelevant (motion is mass-independent); find the time to fall 9.00 m from rest.</w:t>
       </w:r>
     </w:p>
     <w:p>
@@ -3000,42 +3133,6 @@
       </w:pPr>
       <m:oMathPara>
         <m:oMath>
-          <m:r>
-            <m:t xml:space="preserve">y</m:t>
-          </m:r>
-          <m:r>
-            <m:t xml:space="preserve">=</m:t>
-          </m:r>
-          <m:f>
-            <m:num>
-              <m:r>
-                <m:t xml:space="preserve">1</m:t>
-              </m:r>
-            </m:num>
-            <m:den>
-              <m:r>
-                <m:t xml:space="preserve">2</m:t>
-              </m:r>
-            </m:den>
-          </m:f>
-          <m:r>
-            <m:t xml:space="preserve">g</m:t>
-          </m:r>
-          <m:sSup>
-            <m:e>
-              <m:r>
-                <m:t xml:space="preserve">t</m:t>
-              </m:r>
-            </m:e>
-            <m:sup>
-              <m:r>
-                <m:t xml:space="preserve">2</m:t>
-              </m:r>
-            </m:sup>
-          </m:sSup>
-          <m:r>
-            <m:t xml:space="preserve">  ⇒  </m:t>
-          </m:r>
           <m:r>
             <m:t xml:space="preserve">t</m:t>
           </m:r>
@@ -3099,14 +3196,23 @@
     </w:p>
     <w:p>
       <w:pPr>
-        <w:spacing w:after="80"/>
+        <w:spacing w:before="60" w:after="20"/>
+        <w:ind w:left="170"/>
       </w:pPr>
       <w:r>
         <w:rPr>
-          <w:i w:val="0"/>
-          <w:sz w:val="22"/>
+          <w:b/>
+          <w:color w:val="C0392B"/>
+          <w:sz w:val="21"/>
         </w:rPr>
-        <w:t>To just clear the ledge she must cover 1.75 m horizontally in that time:</w:t>
+        <w:t xml:space="preserve">Step 2.  </w:t>
+      </w:r>
+      <w:r>
+        <w:rPr>
+          <w:color w:val="333333"/>
+          <w:sz w:val="21"/>
+        </w:rPr>
+        <w:t>The minimum speed just clears the ledge: cover 1.75 m horizontally in that time.</w:t>
       </w:r>
     </w:p>
     <w:p>
@@ -3362,14 +3468,23 @@
     </w:p>
     <w:p>
       <w:pPr>
-        <w:spacing w:after="80"/>
+        <w:spacing w:before="60" w:after="20"/>
+        <w:ind w:left="170"/>
       </w:pPr>
       <w:r>
         <w:rPr>
-          <w:i w:val="0"/>
-          <w:sz w:val="22"/>
+          <w:b/>
+          <w:color w:val="C0392B"/>
+          <w:sz w:val="21"/>
         </w:rPr>
-        <w:t>With θ = 45° the trajectory (launched from ground level) simplifies to:</w:t>
+        <w:t xml:space="preserve">Step 1.  </w:t>
+      </w:r>
+      <w:r>
+        <w:rPr>
+          <w:color w:val="333333"/>
+          <w:sz w:val="21"/>
+        </w:rPr>
+        <w:t>At θ = 45° the trajectory simplifies (2cos²45° = 1).</w:t>
       </w:r>
     </w:p>
     <w:p>
@@ -3434,14 +3549,23 @@
     </w:p>
     <w:p>
       <w:pPr>
-        <w:spacing w:after="80"/>
+        <w:spacing w:before="60" w:after="20"/>
+        <w:ind w:left="170"/>
       </w:pPr>
       <w:r>
         <w:rPr>
-          <w:i w:val="0"/>
-          <w:sz w:val="22"/>
+          <w:b/>
+          <w:color w:val="C0392B"/>
+          <w:sz w:val="21"/>
         </w:rPr>
-        <w:t>Slowest speed — the jet just clears the near rim (x = 6D, y = 2D):</w:t>
+        <w:t xml:space="preserve">Step 2.  </w:t>
+      </w:r>
+      <w:r>
+        <w:rPr>
+          <w:color w:val="333333"/>
+          <w:sz w:val="21"/>
+        </w:rPr>
+        <w:t>Slowest speed: the jet just clears the near rim (x = 6D, y = 2D). Solve for v₀².</w:t>
       </w:r>
     </w:p>
     <w:p>
@@ -3516,45 +3640,6 @@
           <m:r>
             <m:t xml:space="preserve">  ⇒  </m:t>
           </m:r>
-          <m:sSubSup>
-            <m:e>
-              <m:r>
-                <m:t xml:space="preserve">v</m:t>
-              </m:r>
-            </m:e>
-            <m:sub>
-              <m:r>
-                <m:t xml:space="preserve">0</m:t>
-              </m:r>
-            </m:sub>
-            <m:sup>
-              <m:r>
-                <m:t xml:space="preserve">2</m:t>
-              </m:r>
-            </m:sup>
-          </m:sSubSup>
-          <m:r>
-            <m:t xml:space="preserve">=</m:t>
-          </m:r>
-          <m:r>
-            <m:t xml:space="preserve">9</m:t>
-          </m:r>
-          <m:r>
-            <m:t xml:space="preserve">g</m:t>
-          </m:r>
-          <m:r>
-            <m:t xml:space="preserve">D</m:t>
-          </m:r>
-        </m:oMath>
-      </m:oMathPara>
-    </w:p>
-    <w:p>
-      <w:pPr>
-        <w:spacing w:before="80" w:after="120"/>
-        <w:jc w:val="center"/>
-      </w:pPr>
-      <m:oMathPara>
-        <m:oMath>
           <m:r>
             <m:t xml:space="preserve">v</m:t>
           </m:r>
@@ -3595,14 +3680,23 @@
     </w:p>
     <w:p>
       <w:pPr>
-        <w:spacing w:after="80"/>
+        <w:spacing w:before="60" w:after="20"/>
+        <w:ind w:left="170"/>
       </w:pPr>
       <w:r>
         <w:rPr>
-          <w:i w:val="0"/>
-          <w:sz w:val="22"/>
+          <w:b/>
+          <w:color w:val="C0392B"/>
+          <w:sz w:val="21"/>
         </w:rPr>
-        <w:t>Fastest speed — the jet just reaches the far rim (x = 7D, y = 2D):</w:t>
+        <w:t xml:space="preserve">Step 3.  </w:t>
+      </w:r>
+      <w:r>
+        <w:rPr>
+          <w:color w:val="333333"/>
+          <w:sz w:val="21"/>
+        </w:rPr>
+        <w:t>Fastest speed: the jet just reaches the far rim (x = 7D, y = 2D). Solve for v₀².</w:t>
       </w:r>
     </w:p>
     <w:p>
@@ -3677,49 +3771,13 @@
           <m:r>
             <m:t xml:space="preserve">  ⇒  </m:t>
           </m:r>
-          <m:sSubSup>
-            <m:e>
-              <m:r>
-                <m:t xml:space="preserve">v</m:t>
-              </m:r>
-            </m:e>
-            <m:sub>
-              <m:r>
-                <m:t xml:space="preserve">0</m:t>
-              </m:r>
-            </m:sub>
-            <m:sup>
-              <m:r>
-                <m:t xml:space="preserve">2</m:t>
-              </m:r>
-            </m:sup>
-          </m:sSubSup>
           <m:r>
-            <m:t xml:space="preserve">=</m:t>
+            <m:t xml:space="preserve">v</m:t>
           </m:r>
-          <m:r>
-            <m:t xml:space="preserve">9.8</m:t>
-          </m:r>
-          <m:r>
-            <m:t xml:space="preserve">g</m:t>
-          </m:r>
-          <m:r>
-            <m:t xml:space="preserve">D</m:t>
-          </m:r>
-        </m:oMath>
-      </m:oMathPara>
-    </w:p>
-    <w:p>
-      <w:pPr>
-        <w:spacing w:before="80" w:after="120"/>
-        <w:jc w:val="center"/>
-      </w:pPr>
-      <m:oMathPara>
-        <m:oMath>
           <m:sSub>
             <m:e>
               <m:r>
-                <m:t xml:space="preserve">v</m:t>
+                <m:t xml:space="preserve"/>
               </m:r>
             </m:e>
             <m:sub>
@@ -3750,6 +3808,27 @@
           </m:rad>
         </m:oMath>
       </m:oMathPara>
+    </w:p>
+    <w:p>
+      <w:pPr>
+        <w:spacing w:before="60" w:after="20"/>
+        <w:ind w:left="170"/>
+      </w:pPr>
+      <w:r>
+        <w:rPr>
+          <w:b/>
+          <w:color w:val="C0392B"/>
+          <w:sz w:val="21"/>
+        </w:rPr>
+        <w:t xml:space="preserve">Step 4.  </w:t>
+      </w:r>
+      <w:r>
+        <w:rPr>
+          <w:color w:val="333333"/>
+          <w:sz w:val="21"/>
+        </w:rPr>
+        <w:t>The water enters for any speed between these two limits.</w:t>
+      </w:r>
     </w:p>
     <w:tbl>
       <w:tblPr>
@@ -3797,10 +3876,13 @@
               <m:r>
                 <m:t xml:space="preserve">&lt;</m:t>
               </m:r>
+              <m:r>
+                <m:t xml:space="preserve">v</m:t>
+              </m:r>
               <m:sSub>
                 <m:e>
                   <m:r>
-                    <m:t xml:space="preserve">v</m:t>
+                    <m:t xml:space="preserve"/>
                   </m:r>
                 </m:e>
                 <m:sub>
@@ -3905,14 +3987,23 @@
     </w:p>
     <w:p>
       <w:pPr>
-        <w:spacing w:after="80"/>
+        <w:spacing w:before="60" w:after="20"/>
+        <w:ind w:left="170"/>
       </w:pPr>
       <w:r>
         <w:rPr>
-          <w:i w:val="0"/>
-          <w:sz w:val="22"/>
+          <w:b/>
+          <w:color w:val="C0392B"/>
+          <w:sz w:val="21"/>
         </w:rPr>
-        <w:t>A vertical jump to height h fixes the take-off speed v₀ through energy/kinematics:</w:t>
+        <w:t xml:space="preserve">Step 1.  </w:t>
+      </w:r>
+      <w:r>
+        <w:rPr>
+          <w:color w:val="333333"/>
+          <w:sz w:val="21"/>
+        </w:rPr>
+        <w:t>A vertical jump to height h fixes the take-off speed v₀.</w:t>
       </w:r>
     </w:p>
     <w:p>
@@ -3994,14 +4085,23 @@
     </w:p>
     <w:p>
       <w:pPr>
-        <w:spacing w:after="80"/>
+        <w:spacing w:before="60" w:after="20"/>
+        <w:ind w:left="170"/>
       </w:pPr>
       <w:r>
         <w:rPr>
-          <w:i w:val="0"/>
-          <w:sz w:val="22"/>
+          <w:b/>
+          <w:color w:val="C0392B"/>
+          <w:sz w:val="21"/>
         </w:rPr>
-        <w:t>(a)  The horizontal range is maximum at 45°, where R = v₀²/g:</w:t>
+        <w:t xml:space="preserve">Step 2.  </w:t>
+      </w:r>
+      <w:r>
+        <w:rPr>
+          <w:color w:val="333333"/>
+          <w:sz w:val="21"/>
+        </w:rPr>
+        <w:t>(a) Maximum range occurs at 45°, where R = v₀²/g; substitute v₀².</w:t>
       </w:r>
     </w:p>
     <w:p>
@@ -4144,14 +4244,23 @@
     </w:p>
     <w:p>
       <w:pPr>
-        <w:spacing w:after="80"/>
+        <w:spacing w:before="60" w:after="20"/>
+        <w:ind w:left="170"/>
       </w:pPr>
       <w:r>
         <w:rPr>
-          <w:i w:val="0"/>
-          <w:sz w:val="22"/>
+          <w:b/>
+          <w:color w:val="C0392B"/>
+          <w:sz w:val="21"/>
         </w:rPr>
-        <w:t>(b)  Time aloft in each case (v₀ = √(2gh)):</w:t>
+        <w:t xml:space="preserve">Step 3.  </w:t>
+      </w:r>
+      <w:r>
+        <w:rPr>
+          <w:color w:val="333333"/>
+          <w:sz w:val="21"/>
+        </w:rPr>
+        <w:t>(b) Compute the time aloft for each launch angle using t = 2v₀sinθ/g.</w:t>
       </w:r>
     </w:p>
     <w:p>
@@ -4184,10 +4293,13 @@
               <m:r>
                 <m:t xml:space="preserve">2</m:t>
               </m:r>
+              <m:r>
+                <m:t xml:space="preserve">v</m:t>
+              </m:r>
               <m:sSub>
                 <m:e>
                   <m:r>
-                    <m:t xml:space="preserve">v</m:t>
+                    <m:t xml:space="preserve"/>
                   </m:r>
                 </m:e>
                 <m:sub>
@@ -4265,10 +4377,13 @@
               <m:r>
                 <m:t xml:space="preserve">2</m:t>
               </m:r>
+              <m:r>
+                <m:t xml:space="preserve">v</m:t>
+              </m:r>
               <m:sSub>
                 <m:e>
                   <m:r>
-                    <m:t xml:space="preserve">v</m:t>
+                    <m:t xml:space="preserve"/>
                   </m:r>
                 </m:e>
                 <m:sub>

</xml_diff>